<commit_message>
Manuscript: Elsevier highlight/abstract limits, appendix figure order, CV seed note
Co-Authored-By: Claude Opus 5.5 <noreply@anthropic.com>
Claude-Session: https://claude.ai/code/session_013YZEeiGhMVxgGCcfdnFMn9
</commit_message>
<xml_diff>
--- a/paper/manuscript_v3.docx
+++ b/paper/manuscript_v3.docx
@@ -228,7 +228,7 @@
         </w:numPr>
       </w:pPr>
       <w:r>
-        <w:t xml:space="preserve">A small network maps mix composition to the moisture transport parameters of concrete.</w:t>
+        <w:t xml:space="preserve">A small network maps concrete mix composition to moisture transport parameters.</w:t>
       </w:r>
     </w:p>
     <w:p>
@@ -240,7 +240,7 @@
         </w:numPr>
       </w:pPr>
       <w:r>
-        <w:t xml:space="preserve">It is trained through a transport solver, so predictions obey the governing equation.</w:t>
+        <w:t xml:space="preserve">It is trained through a transport solver, so its predictions obey the governing PDE.</w:t>
       </w:r>
     </w:p>
     <w:p>
@@ -252,7 +252,7 @@
         </w:numPr>
       </w:pPr>
       <w:r>
-        <w:t xml:space="preserve">Unseen mixes are predicted with R² = 0.9931; it holds when a binder family is left out.</w:t>
+        <w:t xml:space="preserve">Withheld mixes are predicted with R² = 0.9931, even with a binder family left out.</w:t>
       </w:r>
     </w:p>
     <w:p>
@@ -264,7 +264,7 @@
         </w:numPr>
       </w:pPr>
       <w:r>
-        <w:t xml:space="preserve">A PINN fitted to the same data returns parameters that fail an independent solver check.</w:t>
+        <w:t xml:space="preserve">A PINN fits the same data, but its parameters fail an independent solver check.</w:t>
       </w:r>
     </w:p>
     <w:p>
@@ -276,7 +276,7 @@
         </w:numPr>
       </w:pPr>
       <w:r>
-        <w:t xml:space="preserve">Disc geometry, identifiability and data errors are treated explicitly; code is public.</w:t>
+        <w:t xml:space="preserve">Real disc geometry, identifiability and data errors are handled; the code is open.</w:t>
       </w:r>
     </w:p>
     <w:bookmarkEnd w:id="20"/>
@@ -294,7 +294,7 @@
         <w:pStyle w:val="FirstParagraph"/>
       </w:pPr>
       <w:r>
-        <w:t xml:space="preserve">Drying tests on concrete usually record only the mass of the specimen, i.e. its average degree of saturation. Recovering transport properties from such curves is an ill-posed inverse problem, normally solved one mix at a time. We propose a physics-embedded neural network (PENN) in which a small network maps the mix composition (water-to-binder ratio, fly ash and slag contents) to the parameters of a nonlinear vapour–capillary diffusivity, and a solver of the moisture transport equation in the actual disc geometry converts these parameters into drying curves. The network is trained through the solver, so every prediction satisfies the governing equation and the parameters of a new mix are obtained from its composition alone. The method was tested on 932 drying measurements of 20 plain, binary and ternary concretes after correcting duplicated and shifted series in the digitised source data. Only two parameters per mix, the reference diffusivity and the intrinsic permeability, proved identifiable. On six withheld mixes the PENN reached R² = 0.9931 (RMSE = 0.0137), a 32% lower error than a purely data-driven network and the same accuracy as classical identification combined with composition regression. When a whole binder family was withheld, the physics-based models kept R² ≥ 0.965 for every mix, whereas the data-driven network dropped to 0.22. A physics-informed neural network (PINN) trained on the same data reproduced the curves, but its parameters did not reproduce them in an independent solver (R² = 0.860). Embedding the solver, rather than penalising a residual, yields transferable and physically consistent transport parameters from routine gravimetric tests.</w:t>
+        <w:t xml:space="preserve">Drying tests on concrete usually record only the specimen mass, i.e. the average degree of saturation. Recovering transport properties from such curves is an ill-posed inverse problem, normally solved one mix at a time. We propose a physics-embedded neural network (PENN) in which a small network maps the mix composition (water-to-binder ratio, fly ash and slag contents) to the parameters of a nonlinear vapour–capillary diffusivity, and a solver of the moisture transport equation in the actual disc geometry converts these parameters into drying curves. Because the network is trained through the solver, every prediction satisfies the governing equation and a new mix needs only its composition. The method was tested on 932 drying measurements of 20 plain, binary and ternary concretes after correcting duplicated and time-shifted series in the source data. Only two parameters per mix, the reference diffusivity and the intrinsic permeability, proved identifiable. On six withheld mixes the PENN reached R² = 0.9931 (RMSE = 0.0137), a 32% lower error than a purely data-driven network and the same accuracy as classical identification combined with composition regression. When a whole binder family was withheld, the physics-based models kept R² ≥ 0.965 for every mix, whereas the data-driven network dropped to 0.22. A physics-informed neural network (PINN) trained on the same data reproduced the curves, but its parameters did not reproduce them in an independent solver (R² = 0.860). Embedding the solver, rather than penalising a residual, yields transferable and physically consistent transport parameters from routine gravimetric tests.</w:t>
       </w:r>
     </w:p>
     <w:p>
@@ -9003,7 +9003,7 @@
         </m:sSub>
       </m:oMath>
       <w:r>
-        <w:t xml:space="preserve">, which is well below the discretisation error. Training uses Adam [30] (learning rate 0.02, decay 0.995 per iteration, weight decay 10⁻⁴) for 400 full-batch iterations.</w:t>
+        <w:t xml:space="preserve">, which is well below the discretisation error. Training uses Adam [30] (learning rate 0.02, decay 0.995 per iteration, weight decay 10⁻⁴) for 400 full-batch iterations, after which the training error no longer changes (Fig. B.1a).</w:t>
       </w:r>
     </w:p>
     <w:p>
@@ -9871,7 +9871,7 @@
         </m:sSub>
       </m:oMath>
       <w:r>
-        <w:t xml:space="preserve">, which keeps it bounded at early times, and half of the 3000 collocation points per iteration are sampled in the similarity variable so that the drying front is resolved at every time. Training uses 3000 Adam iterations followed by 1000 L-BFGS iterations.</w:t>
+        <w:t xml:space="preserve">, which keeps it bounded at early times, and half of the 3000 collocation points per iteration are sampled in the similarity variable so that the drying front is resolved at every time. Training uses 3000 Adam iterations followed by 1000 L-BFGS iterations (Fig. B.1b).</w:t>
       </w:r>
     </w:p>
     <w:p>
@@ -10197,7 +10197,7 @@
         <w:t xml:space="preserve"> </w:t>
       </w:r>
       <w:r>
-        <w:t xml:space="preserve">Leave-one-mix-out over the 20 mixes, and leave-one-binder-family-out, in which all mixes of one of the seven binder systems are predicted from the other six.</w:t>
+        <w:t xml:space="preserve">Leave-one-mix-out over the 20 mixes, and leave-one-binder-family-out, in which all mixes of one of the seven binder systems are predicted from the other six. Each fold was trained once (one seed), since the hold-out test showed a negligible spread between seeds.</w:t>
       </w:r>
     </w:p>
     <w:p>
@@ -13546,7 +13546,7 @@
         <w:t xml:space="preserve"> </w:t>
       </w:r>
       <w:r>
-        <w:t xml:space="preserve">controls the capillary regime, which prevails in the specimen during the first day of drying, before the first measurement and where the PDE residual is hardest to enforce. The PINN can therefore reproduce the measured curves with a field that does not obey the transport equation early on; the corresponding profiles are compared in Appendix B. Because the PENN integrates the equation from</w:t>
+        <w:t xml:space="preserve">controls the capillary regime, which prevails in the specimen during the first day of drying, before the first measurement and where the PDE residual is hardest to enforce. The PINN can therefore reproduce the measured curves with a field that does not obey the transport equation early on; the corresponding profiles are compared in Fig. B.2. Because the PENN integrates the equation from</w:t>
       </w:r>
       <w:r>
         <w:t xml:space="preserve"> </w:t>
@@ -15379,13 +15379,13 @@
       </w:tr>
     </w:tbl>
     <w:bookmarkEnd w:id="80"/>
-    <w:bookmarkStart w:id="87" w:name="X12528b4c3d1f6514706298d2f8258afce4c8042"/>
+    <w:bookmarkStart w:id="87" w:name="Xda09df44b9aa243860d11cc7964992e63a93efe"/>
     <w:p>
       <w:pPr>
         <w:pStyle w:val="Heading1"/>
       </w:pPr>
       <w:r>
-        <w:t xml:space="preserve">Appendix B. PINN profiles and training histories</w:t>
+        <w:t xml:space="preserve">Appendix B. Training histories and PINN profiles</w:t>
       </w:r>
     </w:p>
     <w:p>
@@ -15395,20 +15395,85 @@
       <w:r>
         <w:drawing>
           <wp:inline>
-            <wp:extent cx="5334000" cy="2520429"/>
+            <wp:extent cx="5334000" cy="2225226"/>
             <wp:effectExtent b="0" l="0" r="0" t="0"/>
-            <wp:docPr descr="Fig. B.1. Saturation profiles of three withheld mixes on the slab model, computed by the BDF solver with the PENN parameters (solid) and by the PINN (dotted). The two differ most during the first two days." title="" id="82" name="Picture"/>
+            <wp:docPr descr="Fig. B.1. Training histories: (a) RMSE of the PENN on the training mixes (five seeds); (b) loss terms of the PINN (median and range over three seeds)." title="" id="82" name="Picture"/>
             <a:graphic>
               <a:graphicData uri="http://schemas.openxmlformats.org/drawingml/2006/picture">
                 <pic:pic>
                   <pic:nvPicPr>
-                    <pic:cNvPr descr="fig3/fig_profiles_slab.png" id="83" name="Picture"/>
+                    <pic:cNvPr descr="fig3/fig_convergence.png" id="83" name="Picture"/>
                     <pic:cNvPicPr>
                       <a:picLocks noChangeArrowheads="1" noChangeAspect="1"/>
                     </pic:cNvPicPr>
                   </pic:nvPicPr>
                   <pic:blipFill>
                     <a:blip r:embed="rId81"/>
+                    <a:stretch>
+                      <a:fillRect/>
+                    </a:stretch>
+                  </pic:blipFill>
+                  <pic:spPr bwMode="auto">
+                    <a:xfrm>
+                      <a:off x="0" y="0"/>
+                      <a:ext cx="5334000" cy="2225226"/>
+                    </a:xfrm>
+                    <a:prstGeom prst="rect">
+                      <a:avLst/>
+                    </a:prstGeom>
+                    <a:noFill/>
+                    <a:ln w="9525">
+                      <a:noFill/>
+                      <a:headEnd/>
+                      <a:tailEnd/>
+                    </a:ln>
+                  </pic:spPr>
+                </pic:pic>
+              </a:graphicData>
+            </a:graphic>
+          </wp:inline>
+        </w:drawing>
+      </w:r>
+    </w:p>
+    <w:p>
+      <w:pPr>
+        <w:pStyle w:val="ImageCaption"/>
+      </w:pPr>
+      <w:r>
+        <w:rPr>
+          <w:bCs/>
+          <w:b/>
+        </w:rPr>
+        <w:t xml:space="preserve">Fig. B.1.</w:t>
+      </w:r>
+      <w:r>
+        <w:t xml:space="preserve"> </w:t>
+      </w:r>
+      <w:r>
+        <w:t xml:space="preserve">Training histories: (a) RMSE of the PENN on the training mixes (five seeds); (b) loss terms of the PINN (median and range over three seeds).</w:t>
+      </w:r>
+    </w:p>
+    <w:p>
+      <w:pPr>
+        <w:pStyle w:val="CaptionedFigure"/>
+      </w:pPr>
+      <w:r>
+        <w:drawing>
+          <wp:inline>
+            <wp:extent cx="5334000" cy="2520429"/>
+            <wp:effectExtent b="0" l="0" r="0" t="0"/>
+            <wp:docPr descr="Fig. B.2. Saturation profiles of three withheld mixes on the slab model, computed by the BDF solver with the PENN parameters (solid) and by the PINN (dotted). The two differ most during the first two days." title="" id="85" name="Picture"/>
+            <a:graphic>
+              <a:graphicData uri="http://schemas.openxmlformats.org/drawingml/2006/picture">
+                <pic:pic>
+                  <pic:nvPicPr>
+                    <pic:cNvPr descr="fig3/fig_profiles_slab.png" id="86" name="Picture"/>
+                    <pic:cNvPicPr>
+                      <a:picLocks noChangeArrowheads="1" noChangeAspect="1"/>
+                    </pic:cNvPicPr>
+                  </pic:nvPicPr>
+                  <pic:blipFill>
+                    <a:blip r:embed="rId84"/>
                     <a:stretch>
                       <a:fillRect/>
                     </a:stretch>
@@ -15444,78 +15509,13 @@
           <w:bCs/>
           <w:b/>
         </w:rPr>
-        <w:t xml:space="preserve">Fig. B.1.</w:t>
+        <w:t xml:space="preserve">Fig. B.2.</w:t>
       </w:r>
       <w:r>
         <w:t xml:space="preserve"> </w:t>
       </w:r>
       <w:r>
         <w:t xml:space="preserve">Saturation profiles of three withheld mixes on the slab model, computed by the BDF solver with the PENN parameters (solid) and by the PINN (dotted). The two differ most during the first two days.</w:t>
-      </w:r>
-    </w:p>
-    <w:p>
-      <w:pPr>
-        <w:pStyle w:val="CaptionedFigure"/>
-      </w:pPr>
-      <w:r>
-        <w:drawing>
-          <wp:inline>
-            <wp:extent cx="5334000" cy="2225226"/>
-            <wp:effectExtent b="0" l="0" r="0" t="0"/>
-            <wp:docPr descr="Fig. B.2. Training histories: (a) RMSE of the PENN on the training mixes (five seeds); (b) loss terms of the PINN (median and range over three seeds)." title="" id="85" name="Picture"/>
-            <a:graphic>
-              <a:graphicData uri="http://schemas.openxmlformats.org/drawingml/2006/picture">
-                <pic:pic>
-                  <pic:nvPicPr>
-                    <pic:cNvPr descr="fig3/fig_convergence.png" id="86" name="Picture"/>
-                    <pic:cNvPicPr>
-                      <a:picLocks noChangeArrowheads="1" noChangeAspect="1"/>
-                    </pic:cNvPicPr>
-                  </pic:nvPicPr>
-                  <pic:blipFill>
-                    <a:blip r:embed="rId84"/>
-                    <a:stretch>
-                      <a:fillRect/>
-                    </a:stretch>
-                  </pic:blipFill>
-                  <pic:spPr bwMode="auto">
-                    <a:xfrm>
-                      <a:off x="0" y="0"/>
-                      <a:ext cx="5334000" cy="2225226"/>
-                    </a:xfrm>
-                    <a:prstGeom prst="rect">
-                      <a:avLst/>
-                    </a:prstGeom>
-                    <a:noFill/>
-                    <a:ln w="9525">
-                      <a:noFill/>
-                      <a:headEnd/>
-                      <a:tailEnd/>
-                    </a:ln>
-                  </pic:spPr>
-                </pic:pic>
-              </a:graphicData>
-            </a:graphic>
-          </wp:inline>
-        </w:drawing>
-      </w:r>
-    </w:p>
-    <w:p>
-      <w:pPr>
-        <w:pStyle w:val="ImageCaption"/>
-      </w:pPr>
-      <w:r>
-        <w:rPr>
-          <w:bCs/>
-          <w:b/>
-        </w:rPr>
-        <w:t xml:space="preserve">Fig. B.2.</w:t>
-      </w:r>
-      <w:r>
-        <w:t xml:space="preserve"> </w:t>
-      </w:r>
-      <w:r>
-        <w:t xml:space="preserve">Training histories: (a) RMSE of the PENN on the training mixes (five seeds); (b) loss terms of the PINN (median and range over three seeds).</w:t>
       </w:r>
     </w:p>
     <w:bookmarkEnd w:id="87"/>

</xml_diff>

<commit_message>
Fig. 10: line-style contours instead of overlapping labels
Co-Authored-By: Claude Opus 5.5 <noreply@anthropic.com>
Claude-Session: https://claude.ai/code/session_013YZEeiGhMVxgGCcfdnFMn9
</commit_message>
<xml_diff>
--- a/paper/manuscript_v3.docx
+++ b/paper/manuscript_v3.docx
@@ -14179,7 +14179,7 @@
           <wp:inline>
             <wp:extent cx="5334000" cy="2531343"/>
             <wp:effectExtent b="0" l="0" r="0" t="0"/>
-            <wp:docPr descr="Fig. 10. Saturation in the disc (one quarter of the cross-section; drying faces at the top and right) predicted by the PENN for the withheld mixes C-0.4 and F20-0.3 after 1, 7 and 28 days." title="" id="71" name="Picture"/>
+            <wp:docPr descr="Fig. 10. Saturation in the disc (one quarter of the cross-section; drying faces at the top and right) predicted by the PENN for the withheld mixes C-0.4 and F20-0.3 after 1, 7 and 28 days. Contours: S = 0.75 (solid), 0.50 (dashed) and 0.25 (dotted)." title="" id="71" name="Picture"/>
             <a:graphic>
               <a:graphicData uri="http://schemas.openxmlformats.org/drawingml/2006/picture">
                 <pic:pic>
@@ -14232,7 +14232,21 @@
         <w:t xml:space="preserve"> </w:t>
       </w:r>
       <w:r>
-        <w:t xml:space="preserve">Saturation in the disc (one quarter of the cross-section; drying faces at the top and right) predicted by the PENN for the withheld mixes C-0.4 and F20-0.3 after 1, 7 and 28 days.</w:t>
+        <w:t xml:space="preserve">Saturation in the disc (one quarter of the cross-section; drying faces at the top and right) predicted by the PENN for the withheld mixes C-0.4 and F20-0.3 after 1, 7 and 28 days. Contours:</w:t>
+      </w:r>
+      <w:r>
+        <w:t xml:space="preserve"> </w:t>
+      </w:r>
+      <m:oMath>
+        <m:r>
+          <m:t>S</m:t>
+        </m:r>
+      </m:oMath>
+      <w:r>
+        <w:t xml:space="preserve"> </w:t>
+      </w:r>
+      <w:r>
+        <w:t xml:space="preserve">= 0.75 (solid), 0.50 (dashed) and 0.25 (dotted).</w:t>
       </w:r>
     </w:p>
     <w:bookmarkEnd w:id="73"/>

</xml_diff>